<commit_message>
Agregando Diagramas del proyecto
</commit_message>
<xml_diff>
--- a/CU-REVISADOS/CU7_REVISIONESCALAMIENTOS.docx
+++ b/CU-REVISADOS/CU7_REVISIONESCALAMIENTOS.docx
@@ -1266,7 +1266,7 @@
           <w:sz w:val="22"/>
           <w:szCs w:val="22"/>
         </w:rPr>
-        <w:t>FA01</w:t>
+        <w:t>FA0</w:t>
       </w:r>
     </w:p>
     <w:p>
@@ -1488,13 +1488,19 @@
         <w:fldChar w:fldCharType="begin"/>
       </w:r>
       <w:r>
+        <w:instrText xml:space="preserve"> INCLUDEPICTURE  "https://static.thenounproject.com/png/16443-200.png" \* MERGEFORMATINET </w:instrText>
+      </w:r>
+      <w:r>
+        <w:fldChar w:fldCharType="separate"/>
+      </w:r>
+      <w:r>
+        <w:fldChar w:fldCharType="begin"/>
+      </w:r>
+      <w:r>
         <w:instrText xml:space="preserve"> </w:instrText>
       </w:r>
       <w:r>
-        <w:instrText>INCLUDEPICTURE  "https://stat</w:instrText>
-      </w:r>
-      <w:r>
-        <w:instrText>ic.thenounproject.com/png/16443-200.png" \* MERGEFORMATINET</w:instrText>
+        <w:instrText>INCLUDEPICTURE  "https://static.thenounproject.com/png/16443-200.png" \* MERGEFORMATINET</w:instrText>
       </w:r>
       <w:r>
         <w:instrText xml:space="preserve"> </w:instrText>
@@ -1523,10 +1529,13 @@
             <v:path o:extrusionok="f" gradientshapeok="t" o:connecttype="rect"/>
             <o:lock v:ext="edit" aspectratio="t"/>
           </v:shapetype>
-          <v:shape id="_x0000_i1025" type="#_x0000_t75" alt="Vote Icons - Free SVG &amp; PNG Vote Images - Noun Project" style="width:16.5pt;height:16.5pt">
+          <v:shape id="_x0000_i1025" type="#_x0000_t75" alt="Vote Icons - Free SVG &amp; PNG Vote Images - Noun Project" style="width:16.65pt;height:16.65pt">
             <v:imagedata r:id="rId5" r:href="rId6"/>
           </v:shape>
         </w:pict>
+      </w:r>
+      <w:r>
+        <w:fldChar w:fldCharType="end"/>
       </w:r>
       <w:r>
         <w:fldChar w:fldCharType="end"/>
@@ -1619,50 +1628,6 @@
     </w:p>
     <w:p>
       <w:pPr>
-        <w:pStyle w:val="Prrafodelista"/>
-        <w:spacing w:after="80"/>
-        <w:ind w:left="720"/>
-        <w:rPr>
-          <w:sz w:val="22"/>
-          <w:szCs w:val="22"/>
-        </w:rPr>
-      </w:pPr>
-    </w:p>
-    <w:p>
-      <w:pPr>
-        <w:pStyle w:val="Prrafodelista"/>
-        <w:spacing w:after="80"/>
-        <w:ind w:left="450"/>
-        <w:rPr>
-          <w:sz w:val="22"/>
-          <w:szCs w:val="22"/>
-        </w:rPr>
-      </w:pPr>
-    </w:p>
-    <w:p>
-      <w:pPr>
-        <w:pStyle w:val="Prrafodelista"/>
-        <w:spacing w:after="80"/>
-        <w:ind w:left="450"/>
-        <w:rPr>
-          <w:sz w:val="22"/>
-          <w:szCs w:val="22"/>
-        </w:rPr>
-      </w:pPr>
-    </w:p>
-    <w:p>
-      <w:pPr>
-        <w:pStyle w:val="Prrafodelista"/>
-        <w:spacing w:after="80"/>
-        <w:ind w:left="450"/>
-        <w:rPr>
-          <w:sz w:val="22"/>
-          <w:szCs w:val="22"/>
-        </w:rPr>
-      </w:pPr>
-    </w:p>
-    <w:p>
-      <w:pPr>
         <w:pStyle w:val="Ttulo2"/>
         <w:numPr>
           <w:ilvl w:val="1"/>
@@ -1671,6 +1636,7 @@
         <w:spacing w:after="0"/>
       </w:pPr>
       <w:r>
+        <w:lastRenderedPageBreak/>
         <w:t>Flujos Alternos</w:t>
       </w:r>
     </w:p>
@@ -1823,13 +1789,19 @@
         <w:fldChar w:fldCharType="begin"/>
       </w:r>
       <w:r>
+        <w:instrText xml:space="preserve"> INCLUDEPICTURE  "https://static.thenounproject.com/png/16443-200.png" \* MERGEFORMATINET </w:instrText>
+      </w:r>
+      <w:r>
+        <w:fldChar w:fldCharType="separate"/>
+      </w:r>
+      <w:r>
+        <w:fldChar w:fldCharType="begin"/>
+      </w:r>
+      <w:r>
         <w:instrText xml:space="preserve"> </w:instrText>
       </w:r>
       <w:r>
-        <w:instrText>INCLUDEPICTURE  "https://static.thenounproject.</w:instrText>
-      </w:r>
-      <w:r>
-        <w:instrText>com/png/16443-200.png" \* MERGEFORMATINET</w:instrText>
+        <w:instrText>INCLUDEPICTURE  "https://static.thenounproject.com/png/16443-200.png" \* MERGEFORMATINET</w:instrText>
       </w:r>
       <w:r>
         <w:instrText xml:space="preserve"> </w:instrText>
@@ -1839,10 +1811,13 @@
       </w:r>
       <w:r>
         <w:pict w14:anchorId="4C0BDD53">
-          <v:shape id="_x0000_i1026" type="#_x0000_t75" alt="Vote Icons - Free SVG &amp; PNG Vote Images - Noun Project" style="width:14.25pt;height:14.25pt">
+          <v:shape id="_x0000_i1026" type="#_x0000_t75" alt="Vote Icons - Free SVG &amp; PNG Vote Images - Noun Project" style="width:13.95pt;height:13.95pt">
             <v:imagedata r:id="rId5" r:href="rId7"/>
           </v:shape>
         </w:pict>
+      </w:r>
+      <w:r>
+        <w:fldChar w:fldCharType="end"/>
       </w:r>
       <w:r>
         <w:fldChar w:fldCharType="end"/>
@@ -2511,7 +2486,6 @@
           <w:sz w:val="22"/>
           <w:szCs w:val="22"/>
         </w:rPr>
-        <w:lastRenderedPageBreak/>
         <w:t xml:space="preserve">El sistema incorpora el avance al historial y muestra en la ventana la sección “Avance de la atención”, </w:t>
       </w:r>
       <w:r>
@@ -2615,6 +2589,7 @@
           <w:sz w:val="22"/>
           <w:szCs w:val="22"/>
         </w:rPr>
+        <w:lastRenderedPageBreak/>
         <w:t>FA05 El supervisor declara improcedente la solicitud</w:t>
       </w:r>
     </w:p>
@@ -3374,7 +3349,6 @@
           <w:sz w:val="22"/>
           <w:szCs w:val="22"/>
         </w:rPr>
-        <w:lastRenderedPageBreak/>
         <w:t>FA09 El supervisor regresa la solicitud a En proceso</w:t>
       </w:r>
     </w:p>
@@ -3477,6 +3451,7 @@
           <w:sz w:val="22"/>
           <w:szCs w:val="22"/>
         </w:rPr>
+        <w:lastRenderedPageBreak/>
         <w:t>El sistema traslada la solicitud a la situación “En proceso” e incorpora el avance al historial.</w:t>
       </w:r>
     </w:p>
@@ -4803,6 +4778,15 @@
               <w:fldChar w:fldCharType="begin"/>
             </w:r>
             <w:r>
+              <w:instrText xml:space="preserve"> INCLUDEPICTURE  "https://static.thenounproject.com/png/16443-200.png" \* MERGEFORMATINET </w:instrText>
+            </w:r>
+            <w:r>
+              <w:fldChar w:fldCharType="separate"/>
+            </w:r>
+            <w:r>
+              <w:fldChar w:fldCharType="begin"/>
+            </w:r>
+            <w:r>
               <w:instrText xml:space="preserve"> </w:instrText>
             </w:r>
             <w:r>
@@ -4816,7 +4800,7 @@
             </w:r>
             <w:r>
               <w:pict w14:anchorId="1C3E2742">
-                <v:shape id="_x0000_i1027" type="#_x0000_t75" alt="Vote Icons - Free SVG &amp; PNG Vote Images - Noun Project" style="width:16.5pt;height:16.5pt">
+                <v:shape id="_x0000_i1027" type="#_x0000_t75" alt="Vote Icons - Free SVG &amp; PNG Vote Images - Noun Project" style="width:16.65pt;height:16.65pt">
                   <v:imagedata r:id="rId5" r:href="rId8"/>
                 </v:shape>
               </w:pict>
@@ -4831,6 +4815,9 @@
               <w:fldChar w:fldCharType="end"/>
             </w:r>
             <w:r>
+              <w:fldChar w:fldCharType="end"/>
+            </w:r>
+            <w:r>
               <w:rPr>
                 <w:rFonts w:eastAsia="Calibri"/>
                 <w:sz w:val="20"/>
@@ -4864,7 +4851,10 @@
           <w:szCs w:val="22"/>
         </w:rPr>
       </w:pPr>
-      <w:r>
+    </w:p>
+    <w:p>
+      <w:pPr>
+        <w:spacing w:before="160" w:after="100"/>
         <w:rPr>
           <w:rFonts w:eastAsia="Calibri"/>
           <w:b/>
@@ -4872,6 +4862,76 @@
           <w:sz w:val="22"/>
           <w:szCs w:val="22"/>
         </w:rPr>
+      </w:pPr>
+    </w:p>
+    <w:p>
+      <w:pPr>
+        <w:spacing w:before="160" w:after="100"/>
+        <w:rPr>
+          <w:rFonts w:eastAsia="Calibri"/>
+          <w:b/>
+          <w:bCs/>
+          <w:sz w:val="22"/>
+          <w:szCs w:val="22"/>
+        </w:rPr>
+      </w:pPr>
+    </w:p>
+    <w:p>
+      <w:pPr>
+        <w:spacing w:before="160" w:after="100"/>
+        <w:rPr>
+          <w:rFonts w:eastAsia="Calibri"/>
+          <w:b/>
+          <w:bCs/>
+          <w:sz w:val="22"/>
+          <w:szCs w:val="22"/>
+        </w:rPr>
+      </w:pPr>
+    </w:p>
+    <w:p>
+      <w:pPr>
+        <w:spacing w:before="160" w:after="100"/>
+        <w:rPr>
+          <w:rFonts w:eastAsia="Calibri"/>
+          <w:b/>
+          <w:bCs/>
+          <w:sz w:val="22"/>
+          <w:szCs w:val="22"/>
+        </w:rPr>
+      </w:pPr>
+    </w:p>
+    <w:p>
+      <w:pPr>
+        <w:spacing w:before="160" w:after="100"/>
+        <w:rPr>
+          <w:rFonts w:eastAsia="Calibri"/>
+          <w:b/>
+          <w:bCs/>
+          <w:sz w:val="22"/>
+          <w:szCs w:val="22"/>
+        </w:rPr>
+      </w:pPr>
+    </w:p>
+    <w:p>
+      <w:pPr>
+        <w:spacing w:before="160" w:after="100"/>
+        <w:rPr>
+          <w:rFonts w:eastAsia="Calibri"/>
+          <w:b/>
+          <w:bCs/>
+          <w:sz w:val="22"/>
+          <w:szCs w:val="22"/>
+        </w:rPr>
+      </w:pPr>
+      <w:r>
+        <w:rPr>
+          <w:rFonts w:eastAsia="Calibri"/>
+          <w:b/>
+          <w:bCs/>
+          <w:sz w:val="22"/>
+          <w:szCs w:val="22"/>
+        </w:rPr>
+        <w:lastRenderedPageBreak/>
         <w:t>RN02 Contenido del detalle de la solicitud</w:t>
       </w:r>
     </w:p>
@@ -5064,7 +5124,6 @@
                 <w:sz w:val="20"/>
                 <w:szCs w:val="20"/>
               </w:rPr>
-              <w:lastRenderedPageBreak/>
               <w:t>Tipo y número de boleta</w:t>
             </w:r>
           </w:p>
@@ -6715,7 +6774,10 @@
           <w:szCs w:val="22"/>
         </w:rPr>
       </w:pPr>
-      <w:r>
+    </w:p>
+    <w:p>
+      <w:pPr>
+        <w:spacing w:before="160" w:after="100"/>
         <w:rPr>
           <w:rFonts w:eastAsia="Calibri"/>
           <w:b/>
@@ -6723,6 +6785,28 @@
           <w:sz w:val="22"/>
           <w:szCs w:val="22"/>
         </w:rPr>
+      </w:pPr>
+    </w:p>
+    <w:p>
+      <w:pPr>
+        <w:spacing w:before="160" w:after="100"/>
+        <w:rPr>
+          <w:rFonts w:eastAsia="Calibri"/>
+          <w:b/>
+          <w:bCs/>
+          <w:sz w:val="22"/>
+          <w:szCs w:val="22"/>
+        </w:rPr>
+      </w:pPr>
+      <w:r>
+        <w:rPr>
+          <w:rFonts w:eastAsia="Calibri"/>
+          <w:b/>
+          <w:bCs/>
+          <w:sz w:val="22"/>
+          <w:szCs w:val="22"/>
+        </w:rPr>
+        <w:lastRenderedPageBreak/>
         <w:t>RN04 Datos de las secciones “Decisión del supervisor” y “Avance de la atención”</w:t>
       </w:r>
     </w:p>
@@ -6944,16 +7028,7 @@
                 <w:sz w:val="20"/>
                 <w:szCs w:val="20"/>
               </w:rPr>
-              <w:t xml:space="preserve">Fundamento de la decisión que el supervisor adopta sobre </w:t>
-            </w:r>
-            <w:r>
-              <w:rPr>
-                <w:rFonts w:eastAsia="Calibri"/>
-                <w:sz w:val="20"/>
-                <w:szCs w:val="20"/>
-              </w:rPr>
-              <w:lastRenderedPageBreak/>
-              <w:t>una solicitud escalada.</w:t>
+              <w:t>Fundamento de la decisión que el supervisor adopta sobre una solicitud escalada.</w:t>
             </w:r>
           </w:p>
         </w:tc>
@@ -6982,7 +7057,6 @@
                 <w:sz w:val="20"/>
                 <w:szCs w:val="20"/>
               </w:rPr>
-              <w:lastRenderedPageBreak/>
               <w:t>Texto</w:t>
             </w:r>
           </w:p>
@@ -7012,16 +7086,7 @@
                 <w:sz w:val="20"/>
                 <w:szCs w:val="20"/>
               </w:rPr>
-              <w:t xml:space="preserve">Texto libre y obligatorio, de máximo 200 caracteres. Texto de ejemplo: </w:t>
-            </w:r>
-            <w:r>
-              <w:rPr>
-                <w:rFonts w:eastAsia="Calibri"/>
-                <w:sz w:val="20"/>
-                <w:szCs w:val="20"/>
-              </w:rPr>
-              <w:lastRenderedPageBreak/>
-              <w:t>“Fundamente la decisión que adopta sobre la solicitud”. Se muestra cuando la solicitud está escalada.</w:t>
+              <w:t>Texto libre y obligatorio, de máximo 200 caracteres. Texto de ejemplo: “Fundamente la decisión que adopta sobre la solicitud”. Se muestra cuando la solicitud está escalada.</w:t>
             </w:r>
           </w:p>
         </w:tc>
@@ -7056,7 +7121,6 @@
                 <w:sz w:val="20"/>
                 <w:szCs w:val="20"/>
               </w:rPr>
-              <w:lastRenderedPageBreak/>
               <w:t>Avance de la atención</w:t>
             </w:r>
           </w:p>
@@ -7511,8 +7575,11 @@
                 <w:noProof/>
               </w:rPr>
               <w:pict w14:anchorId="6EA25476">
-                <v:shape id="_x0000_s1030" style="position:absolute;margin-left:-.8pt;margin-top:.25pt;width:55.25pt;height:16.1pt;z-index:1;mso-position-horizontal-relative:char;mso-position-vertical-relative:line" coordsize="21600,21600" filled="f">
-                  <v:stroke endcap="round"/>
+                <v:shape id="_x0000_s1030" style="position:absolute;margin-left:-.8pt;margin-top:.25pt;width:55.25pt;height:16.1pt;z-index:1;mso-position-horizontal-relative:char;mso-position-vertical-relative:line" coordsize="21600,21600" o:spt="100" adj="0,,0" path="" filled="f">
+                  <v:stroke joinstyle="round" endcap="round"/>
+                  <v:formulas/>
+                  <v:path shadowok="f" o:extrusionok="f" fillok="f" insetpenok="f" o:connecttype="segments"/>
+                  <o:lock v:ext="edit" rotation="t" aspectratio="t" verticies="t" text="t" shapetype="t"/>
                   <o:ink i="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" annotation="t"/>
                   <w10:wrap anchorx="page" anchory="page"/>
                 </v:shape>

</xml_diff>